<commit_message>
Rebuild portfolio with calm forest design
</commit_message>
<xml_diff>
--- a/assets/ben-horch-resume.docx
+++ b/assets/ben-horch-resume.docx
@@ -11,7 +11,7 @@
         <w:rPr>
           <w:rFonts w:ascii="Arial" w:hAnsi="Arial" w:eastAsia="Arial"/>
           <w:b/>
-          <w:color w:val="0A0A0A"/>
+          <w:color w:val="171917"/>
           <w:sz w:val="57"/>
         </w:rPr>
         <w:t>BEN HORCH</w:t>
@@ -27,7 +27,7 @@
           <w:rFonts w:ascii="Arial" w:hAnsi="Arial" w:eastAsia="Arial"/>
           <w:b/>
           <w:caps/>
-          <w:color w:val="0B4D2D"/>
+          <w:color w:val="245A43"/>
           <w:sz w:val="20"/>
         </w:rPr>
         <w:t>SOCIAL MEDIA MANAGER  |  CONTENT, COMMUNITY &amp; EMAIL/CRM</w:t>
@@ -39,13 +39,13 @@
         <w:spacing w:before="0" w:after="100"/>
         <w:jc w:val="left"/>
         <w:pBdr>
-          <w:bottom w:val="single" w:sz="12" w:space="5" w:color="0A0A0A"/>
+          <w:bottom w:val="single" w:sz="12" w:space="5" w:color="171917"/>
         </w:pBdr>
       </w:pPr>
       <w:r>
         <w:rPr>
           <w:rFonts w:ascii="Arial" w:hAnsi="Arial" w:eastAsia="Arial"/>
-          <w:color w:val="515151"/>
+          <w:color w:val="5F6762"/>
           <w:sz w:val="16"/>
         </w:rPr>
         <w:t xml:space="preserve">Missouri | Remote, U.S. | Available immediately  |  417-422-3213  |  bhorch45@gmail.com  |  </w:t>
@@ -54,7 +54,7 @@
         <w:r>
           <w:rPr>
             <w:rFonts w:ascii="Arial" w:hAnsi="Arial"/>
-            <w:color w:val="0B4D2D"/>
+            <w:color w:val="245A43"/>
             <w:sz w:val="17"/>
             <w:b/>
             <w:u w:val="single"/>
@@ -65,7 +65,7 @@
       <w:r>
         <w:rPr>
           <w:rFonts w:ascii="Arial" w:hAnsi="Arial" w:eastAsia="Arial"/>
-          <w:color w:val="515151"/>
+          <w:color w:val="5F6762"/>
           <w:sz w:val="16"/>
         </w:rPr>
         <w:t xml:space="preserve">  |  </w:t>
@@ -74,7 +74,7 @@
         <w:r>
           <w:rPr>
             <w:rFonts w:ascii="Arial" w:hAnsi="Arial"/>
-            <w:color w:val="0B4D2D"/>
+            <w:color w:val="245A43"/>
             <w:sz w:val="17"/>
             <w:b/>
             <w:u w:val="single"/>
@@ -89,7 +89,7 @@
         <w:keepNext/>
         <w:keepLines/>
         <w:pBdr>
-          <w:bottom w:val="single" w:sz="8" w:space="2" w:color="0B4D2D"/>
+          <w:bottom w:val="single" w:sz="8" w:space="2" w:color="245A43"/>
         </w:pBdr>
       </w:pPr>
       <w:r>
@@ -97,7 +97,7 @@
           <w:rFonts w:ascii="Arial" w:hAnsi="Arial" w:eastAsia="Arial"/>
           <w:b/>
           <w:caps/>
-          <w:color w:val="0B4D2D"/>
+          <w:color w:val="245A43"/>
           <w:sz w:val="19"/>
         </w:rPr>
         <w:t>SUMMARY</w:t>
@@ -111,7 +111,7 @@
       <w:r>
         <w:rPr>
           <w:rFonts w:ascii="Arial" w:hAnsi="Arial" w:eastAsia="Arial"/>
-          <w:color w:val="0A0A0A"/>
+          <w:color w:val="171917"/>
           <w:sz w:val="19"/>
         </w:rPr>
         <w:t>Social-first growth marketer who founded Bors Finance and built every brand social channel from zero. Grew YouTube to 43.8K subscribers and approx. 10.7M channel views, and Facebook to 62K+ page likes. Builds repeatable research-to-publish systems for complex, high-skepticism topics across video, community, and email.</w:t>
@@ -123,17 +123,17 @@
         <w:keepLines/>
         <w:spacing w:before="40" w:after="100"/>
         <w:ind w:left="144" w:right="144"/>
-        <w:shd w:val="clear" w:color="auto" w:fill="B8FF3D"/>
+        <w:shd w:val="clear" w:color="auto" w:fill="EAF1EC"/>
         <w:pBdr>
-          <w:top w:val="single" w:sz="8" w:space="4" w:color="0A0A0A"/>
-          <w:bottom w:val="single" w:sz="8" w:space="4" w:color="0A0A0A"/>
+          <w:top w:val="single" w:sz="8" w:space="4" w:color="CDD8D1"/>
+          <w:bottom w:val="single" w:sz="8" w:space="4" w:color="CDD8D1"/>
         </w:pBdr>
       </w:pPr>
       <w:r>
         <w:rPr>
           <w:rFonts w:ascii="Arial" w:hAnsi="Arial" w:eastAsia="Arial"/>
           <w:b/>
-          <w:color w:val="0A0A0A"/>
+          <w:color w:val="171917"/>
           <w:sz w:val="16"/>
         </w:rPr>
         <w:t>PROOF IN 10 SECONDS</w:t>
@@ -143,7 +143,7 @@
         <w:rPr>
           <w:rFonts w:ascii="Arial" w:hAnsi="Arial" w:eastAsia="Arial"/>
           <w:b/>
-          <w:color w:val="0A0A0A"/>
+          <w:color w:val="171917"/>
           <w:sz w:val="16"/>
         </w:rPr>
         <w:t>0 to 43.8K YouTube  |  10.7M views  |  0 to 62K+ Facebook  |  550K top Reel  |  approx. 22K email  |  45.1% latest open</w:t>
@@ -155,7 +155,7 @@
         <w:keepNext/>
         <w:keepLines/>
         <w:pBdr>
-          <w:bottom w:val="single" w:sz="8" w:space="2" w:color="0B4D2D"/>
+          <w:bottom w:val="single" w:sz="8" w:space="2" w:color="245A43"/>
         </w:pBdr>
       </w:pPr>
       <w:r>
@@ -163,7 +163,7 @@
           <w:rFonts w:ascii="Arial" w:hAnsi="Arial" w:eastAsia="Arial"/>
           <w:b/>
           <w:caps/>
-          <w:color w:val="0B4D2D"/>
+          <w:color w:val="245A43"/>
           <w:sz w:val="19"/>
         </w:rPr>
         <w:t>EXPERIENCE</w:t>
@@ -181,7 +181,7 @@
         <w:rPr>
           <w:rFonts w:ascii="Arial" w:hAnsi="Arial" w:eastAsia="Arial"/>
           <w:b/>
-          <w:color w:val="0A0A0A"/>
+          <w:color w:val="171917"/>
           <w:sz w:val="21"/>
         </w:rPr>
         <w:t>BORS FINANCE</w:t>
@@ -191,7 +191,7 @@
           <w:rFonts w:ascii="Arial" w:hAnsi="Arial" w:eastAsia="Arial"/>
           <w:b/>
           <w:caps/>
-          <w:color w:val="0B4D2D"/>
+          <w:color w:val="245A43"/>
           <w:sz w:val="16"/>
         </w:rPr>
         <w:tab/>
@@ -207,7 +207,7 @@
         <w:rPr>
           <w:rFonts w:ascii="Arial" w:hAnsi="Arial" w:eastAsia="Arial"/>
           <w:b/>
-          <w:color w:val="515151"/>
+          <w:color w:val="5F6762"/>
           <w:sz w:val="18"/>
         </w:rPr>
         <w:t>Founder &amp; CEO | Social, Content and Growth</w:t>
@@ -226,7 +226,7 @@
       <w:r>
         <w:rPr>
           <w:rFonts w:ascii="Arial" w:hAnsi="Arial" w:eastAsia="Arial"/>
-          <w:color w:val="0A0A0A"/>
+          <w:color w:val="171917"/>
           <w:sz w:val="18"/>
         </w:rPr>
         <w:t>Founded the brand and launched every social account from zero; led social and content across YouTube, Facebook, TikTok, Instagram, email, Discord, and Telegram.</w:t>
@@ -245,7 +245,7 @@
       <w:r>
         <w:rPr>
           <w:rFonts w:ascii="Arial" w:hAnsi="Arial" w:eastAsia="Arial"/>
-          <w:color w:val="0A0A0A"/>
+          <w:color w:val="171917"/>
           <w:sz w:val="18"/>
         </w:rPr>
         <w:t>Grew YouTube from 0 to 43.8K subscribers and approx. 10.7M channel views while scaling production to 1,100+ total uploads; grew Facebook from 0 to 62K+ page likes.</w:t>
@@ -264,7 +264,7 @@
       <w:r>
         <w:rPr>
           <w:rFonts w:ascii="Arial" w:hAnsi="Arial" w:eastAsia="Arial"/>
-          <w:color w:val="0A0A0A"/>
+          <w:color w:val="171917"/>
           <w:sz w:val="18"/>
         </w:rPr>
         <w:t>Led the short-form operation behind public Bors Finance Reels reaching 550K, 196K, 115K, 83K, and 76K views.</w:t>
@@ -283,7 +283,7 @@
       <w:r>
         <w:rPr>
           <w:rFonts w:ascii="Arial" w:hAnsi="Arial" w:eastAsia="Arial"/>
-          <w:color w:val="0A0A0A"/>
+          <w:color w:val="171917"/>
           <w:sz w:val="18"/>
         </w:rPr>
         <w:t>Owned the workflow from research, hooks, and scripts through editing, captions, B-roll, audio, publishing, analytics, community, and subscriptions.</w:t>
@@ -301,7 +301,7 @@
         <w:rPr>
           <w:rFonts w:ascii="Arial" w:hAnsi="Arial" w:eastAsia="Arial"/>
           <w:b/>
-          <w:color w:val="0A0A0A"/>
+          <w:color w:val="171917"/>
           <w:sz w:val="21"/>
         </w:rPr>
         <w:t>THE FIFTH SIGNAL</w:t>
@@ -311,7 +311,7 @@
           <w:rFonts w:ascii="Arial" w:hAnsi="Arial" w:eastAsia="Arial"/>
           <w:b/>
           <w:caps/>
-          <w:color w:val="0B4D2D"/>
+          <w:color w:val="245A43"/>
           <w:sz w:val="16"/>
         </w:rPr>
         <w:tab/>
@@ -327,7 +327,7 @@
         <w:rPr>
           <w:rFonts w:ascii="Arial" w:hAnsi="Arial" w:eastAsia="Arial"/>
           <w:b/>
-          <w:color w:val="515151"/>
+          <w:color w:val="5F6762"/>
           <w:sz w:val="18"/>
         </w:rPr>
         <w:t>Founder | Email, Lifecycle and Growth</w:t>
@@ -346,7 +346,7 @@
       <w:r>
         <w:rPr>
           <w:rFonts w:ascii="Arial" w:hAnsi="Arial" w:eastAsia="Arial"/>
-          <w:color w:val="0A0A0A"/>
+          <w:color w:val="171917"/>
           <w:sz w:val="18"/>
         </w:rPr>
         <w:t>Reactivated an approx. 22K-subscriber email list; five measured campaigns delivered 112,144 emails at a 35.5% weighted open rate, with the latest reaching 45.1%.</w:t>
@@ -365,7 +365,7 @@
       <w:r>
         <w:rPr>
           <w:rFonts w:ascii="Arial" w:hAnsi="Arial" w:eastAsia="Arial"/>
-          <w:color w:val="0A0A0A"/>
+          <w:color w:val="171917"/>
           <w:sz w:val="18"/>
         </w:rPr>
         <w:t>Improved open rate 11.17 percentage points from the return email to the latest recorded campaign.</w:t>
@@ -384,7 +384,7 @@
       <w:r>
         <w:rPr>
           <w:rFonts w:ascii="Arial" w:hAnsi="Arial" w:eastAsia="Arial"/>
-          <w:color w:val="0A0A0A"/>
+          <w:color w:val="171917"/>
           <w:sz w:val="18"/>
         </w:rPr>
         <w:t>Built a research-to-retention journey spanning content, lead capture, checkout, lifecycle email, Telegram delivery, and support; shipped 30+ funnel and product iterations with AI-assisted workflows.</w:t>
@@ -396,7 +396,7 @@
         <w:keepNext/>
         <w:keepLines/>
         <w:pBdr>
-          <w:bottom w:val="single" w:sz="8" w:space="2" w:color="0B4D2D"/>
+          <w:bottom w:val="single" w:sz="8" w:space="2" w:color="245A43"/>
         </w:pBdr>
       </w:pPr>
       <w:r>
@@ -404,7 +404,7 @@
           <w:rFonts w:ascii="Arial" w:hAnsi="Arial" w:eastAsia="Arial"/>
           <w:b/>
           <w:caps/>
-          <w:color w:val="0B4D2D"/>
+          <w:color w:val="245A43"/>
           <w:sz w:val="19"/>
         </w:rPr>
         <w:t>CORE SKILLS</w:t>
@@ -417,7 +417,7 @@
       <w:r>
         <w:rPr>
           <w:rFonts w:ascii="Arial" w:hAnsi="Arial" w:eastAsia="Arial"/>
-          <w:color w:val="0A0A0A"/>
+          <w:color w:val="171917"/>
           <w:sz w:val="18"/>
         </w:rPr>
         <w:t>Social Strategy | Short- and Long-Form Video | Content Operations | Community Management | Email Marketing | CRM / Lifecycle | Copywriting | Video Editing | Analytics | Landing Pages / CRO | YouTube | Facebook | Instagram | TikTok | Beehiiv | Discord | Telegram</w:t>
@@ -429,7 +429,7 @@
         <w:keepNext/>
         <w:keepLines/>
         <w:pBdr>
-          <w:bottom w:val="single" w:sz="8" w:space="2" w:color="0B4D2D"/>
+          <w:bottom w:val="single" w:sz="8" w:space="2" w:color="245A43"/>
         </w:pBdr>
       </w:pPr>
       <w:r>
@@ -437,7 +437,7 @@
           <w:rFonts w:ascii="Arial" w:hAnsi="Arial" w:eastAsia="Arial"/>
           <w:b/>
           <w:caps/>
-          <w:color w:val="0B4D2D"/>
+          <w:color w:val="245A43"/>
           <w:sz w:val="19"/>
         </w:rPr>
         <w:t>SELECTED WORK</w:t>
@@ -451,7 +451,7 @@
         <w:r>
           <w:rPr>
             <w:rFonts w:ascii="Arial" w:hAnsi="Arial"/>
-            <w:color w:val="0B4D2D"/>
+            <w:color w:val="245A43"/>
             <w:sz w:val="17"/>
             <w:b/>
             <w:u w:val="single"/>
@@ -462,7 +462,7 @@
       <w:r>
         <w:rPr>
           <w:rFonts w:ascii="Arial" w:hAnsi="Arial" w:eastAsia="Arial"/>
-          <w:color w:val="515151"/>
+          <w:color w:val="5F6762"/>
           <w:sz w:val="17"/>
         </w:rPr>
         <w:t xml:space="preserve">  |  </w:t>
@@ -471,7 +471,7 @@
         <w:r>
           <w:rPr>
             <w:rFonts w:ascii="Arial" w:hAnsi="Arial"/>
-            <w:color w:val="0B4D2D"/>
+            <w:color w:val="245A43"/>
             <w:sz w:val="17"/>
             <w:b/>
             <w:u w:val="single"/>
@@ -482,7 +482,7 @@
       <w:r>
         <w:rPr>
           <w:rFonts w:ascii="Arial" w:hAnsi="Arial" w:eastAsia="Arial"/>
-          <w:color w:val="515151"/>
+          <w:color w:val="5F6762"/>
           <w:sz w:val="17"/>
         </w:rPr>
         <w:t xml:space="preserve">  |  </w:t>
@@ -491,7 +491,7 @@
         <w:r>
           <w:rPr>
             <w:rFonts w:ascii="Arial" w:hAnsi="Arial"/>
-            <w:color w:val="0B4D2D"/>
+            <w:color w:val="245A43"/>
             <w:sz w:val="17"/>
             <w:b/>
             <w:u w:val="single"/>
@@ -726,7 +726,7 @@
       </w:pPr>
       <w:rPr>
         <w:rFonts w:ascii="Arial" w:hAnsi="Arial"/>
-        <w:color w:val="0B4D2D"/>
+        <w:color w:val="245A43"/>
       </w:rPr>
     </w:lvl>
   </w:abstractNum>
@@ -901,7 +901,7 @@
     </w:pPr>
     <w:rPr>
       <w:rFonts w:ascii="Arial" w:hAnsi="Arial"/>
-      <w:color w:val="0A0A0A"/>
+      <w:color w:val="171917"/>
       <w:sz w:val="19"/>
     </w:rPr>
   </w:style>
@@ -967,7 +967,7 @@
       <w:rFonts w:asciiTheme="majorHAnsi" w:eastAsiaTheme="majorEastAsia" w:hAnsiTheme="majorHAnsi" w:cstheme="majorBidi" w:ascii="Arial" w:hAnsi="Arial"/>
       <w:b/>
       <w:bCs/>
-      <w:color w:val="0B4D2D"/>
+      <w:color w:val="245A43"/>
       <w:sz w:val="19"/>
       <w:szCs w:val="28"/>
     </w:rPr>

</xml_diff>

<commit_message>
Rebuild portfolio around verified growth proof
</commit_message>
<xml_diff>
--- a/assets/ben-horch-resume.docx
+++ b/assets/ben-horch-resume.docx
@@ -26,11 +26,11 @@
         <w:rPr>
           <w:rFonts w:ascii="Arial" w:hAnsi="Arial" w:eastAsia="Arial"/>
           <w:b/>
-          <w:caps/>
           <w:color w:val="245A43"/>
           <w:sz w:val="20"/>
+          <w:u w:val="none"/>
         </w:rPr>
-        <w:t>SOCIAL MEDIA MANAGER  |  CONTENT, COMMUNITY &amp; EMAIL/CRM</w:t>
+        <w:t>SOCIAL MEDIA &amp; GROWTH MANAGER  |  CONTENT, COMMUNITY &amp; EMAIL/CRM</w:t>
       </w:r>
     </w:p>
     <w:p>
@@ -111,10 +111,12 @@
       <w:r>
         <w:rPr>
           <w:rFonts w:ascii="Arial" w:hAnsi="Arial" w:eastAsia="Arial"/>
+          <w:b w:val="0"/>
           <w:color w:val="171917"/>
           <w:sz w:val="19"/>
+          <w:u w:val="none"/>
         </w:rPr>
-        <w:t>Social-first growth marketer who founded Bors Finance and built every brand social channel from zero. Grew YouTube to 43.8K subscribers and approx. 10.7M channel views, and Facebook to 62K+ page likes. Builds repeatable research-to-publish systems for complex, high-skepticism topics across video, community, and email.</w:t>
+        <w:t>Founder-led social, content, and lifecycle marketer with nearly four years of hands-on experience building audiences and the systems that turn attention into leads, members, and customers. Founded Bors Finance and launched every brand channel from zero across X, Facebook, Instagram, TikTok, YouTube, Discord, Telegram, and email. Owns the full workflow: strategy, research, scripts, production, posting, community, performance analysis, email funnels, conversion, and retention.</w:t>
       </w:r>
     </w:p>
     <w:p>
@@ -135,6 +137,7 @@
           <w:b/>
           <w:color w:val="171917"/>
           <w:sz w:val="16"/>
+          <w:u w:val="none"/>
         </w:rPr>
         <w:t>PROOF IN 10 SECONDS</w:t>
         <w:br/>
@@ -145,8 +148,9 @@
           <w:b/>
           <w:color w:val="171917"/>
           <w:sz w:val="16"/>
+          <w:u w:val="none"/>
         </w:rPr>
-        <w:t>0 to 43.8K YouTube  |  10.7M views  |  0 to 62K+ Facebook  |  550K top Reel  |  approx. 22K email  |  45.1% latest open</w:t>
+        <w:t>0 to 62K+ Facebook  |  550K top public Reel  |  43.8K historical video peak  |  approx. 22K email  |  45.1% latest open  |  Whop profile: $210K+ earned</w:t>
       </w:r>
     </w:p>
     <w:p>
@@ -209,8 +213,9 @@
           <w:b/>
           <w:color w:val="5F6762"/>
           <w:sz w:val="18"/>
+          <w:u w:val="none"/>
         </w:rPr>
-        <w:t>Founder &amp; CEO | Social, Content and Growth</w:t>
+        <w:t>Founder | Social Media, Content &amp; Growth</w:t>
       </w:r>
     </w:p>
     <w:p>
@@ -226,10 +231,12 @@
       <w:r>
         <w:rPr>
           <w:rFonts w:ascii="Arial" w:hAnsi="Arial" w:eastAsia="Arial"/>
+          <w:b w:val="0"/>
           <w:color w:val="171917"/>
           <w:sz w:val="18"/>
+          <w:u w:val="none"/>
         </w:rPr>
-        <w:t>Founded the brand and launched every social account from zero; led social and content across YouTube, Facebook, TikTok, Instagram, email, Discord, and Telegram.</w:t>
+        <w:t>Founded the brand and built every social channel from zero, setting strategy and publishing across X (Twitter), Facebook, Instagram, TikTok, YouTube, Discord, Telegram, and email.</w:t>
       </w:r>
     </w:p>
     <w:p>
@@ -245,10 +252,12 @@
       <w:r>
         <w:rPr>
           <w:rFonts w:ascii="Arial" w:hAnsi="Arial" w:eastAsia="Arial"/>
+          <w:b w:val="0"/>
           <w:color w:val="171917"/>
           <w:sz w:val="18"/>
+          <w:u w:val="none"/>
         </w:rPr>
-        <w:t>Grew YouTube from 0 to 43.8K subscribers and approx. 10.7M channel views while scaling production to 1,100+ total uploads; grew Facebook from 0 to 62K+ page likes.</w:t>
+        <w:t>Grew Facebook from 0 to 62K+ page likes and the video channel from 0 to a historical peak of 43.8K subscribers and approx. 10.7M views; public Facebook Reels reached 550K, 196K, 115K, 83K, and 76K views.</w:t>
       </w:r>
     </w:p>
     <w:p>
@@ -264,10 +273,12 @@
       <w:r>
         <w:rPr>
           <w:rFonts w:ascii="Arial" w:hAnsi="Arial" w:eastAsia="Arial"/>
+          <w:b w:val="0"/>
           <w:color w:val="171917"/>
           <w:sz w:val="18"/>
+          <w:u w:val="none"/>
         </w:rPr>
-        <w:t>Led the short-form operation behind public Bors Finance Reels reaching 550K, 196K, 115K, 83K, and 76K views.</w:t>
+        <w:t>Ran end-to-end content operations: research, hooks, scripts, short- and long-form editing, captions, B-roll, audio, calendars, posting, community management, analytics, testing, and strategy reviews.</w:t>
       </w:r>
     </w:p>
     <w:p>
@@ -283,10 +294,12 @@
       <w:r>
         <w:rPr>
           <w:rFonts w:ascii="Arial" w:hAnsi="Arial" w:eastAsia="Arial"/>
+          <w:b w:val="0"/>
           <w:color w:val="171917"/>
           <w:sz w:val="18"/>
+          <w:u w:val="none"/>
         </w:rPr>
-        <w:t>Owned the workflow from research, hooks, and scripts through editing, captions, B-roll, audio, publishing, analytics, community, and subscriptions.</w:t>
+        <w:t>Connected audience growth to company growth through lead capture, email, memberships, subscriptions, affiliate workflows, landing pages, conversion testing, customer feedback, and support.</w:t>
       </w:r>
     </w:p>
     <w:p>
@@ -346,10 +359,12 @@
       <w:r>
         <w:rPr>
           <w:rFonts w:ascii="Arial" w:hAnsi="Arial" w:eastAsia="Arial"/>
+          <w:b w:val="0"/>
           <w:color w:val="171917"/>
           <w:sz w:val="18"/>
+          <w:u w:val="none"/>
         </w:rPr>
-        <w:t>Reactivated an approx. 22K-subscriber email list; five measured campaigns delivered 112,144 emails at a 35.5% weighted open rate, with the latest reaching 45.1%.</w:t>
+        <w:t>Reactivated an approx. 22K-subscriber email audience; five measured campaigns delivered 112,144 emails at a 35.5% weighted open rate, with the latest reaching 45.1%.</w:t>
       </w:r>
     </w:p>
     <w:p>
@@ -365,10 +380,12 @@
       <w:r>
         <w:rPr>
           <w:rFonts w:ascii="Arial" w:hAnsi="Arial" w:eastAsia="Arial"/>
+          <w:b w:val="0"/>
           <w:color w:val="171917"/>
           <w:sz w:val="18"/>
+          <w:u w:val="none"/>
         </w:rPr>
-        <w:t>Improved open rate 11.17 percentage points from the return email to the latest recorded campaign.</w:t>
+        <w:t>Built and operated the acquisition-to-retention funnel across landing pages, lead capture, checkout, lifecycle email, Telegram delivery, memberships, retention, and customer support.</w:t>
       </w:r>
     </w:p>
     <w:p>
@@ -384,10 +401,33 @@
       <w:r>
         <w:rPr>
           <w:rFonts w:ascii="Arial" w:hAnsi="Arial" w:eastAsia="Arial"/>
+          <w:b w:val="0"/>
           <w:color w:val="171917"/>
           <w:sz w:val="18"/>
+          <w:u w:val="none"/>
         </w:rPr>
-        <w:t>Built a research-to-retention journey spanning content, lead capture, checkout, lifecycle email, Telegram delivery, and support; shipped 30+ funnel and product iterations with AI-assisted workflows.</w:t>
+        <w:t>Shipped 30+ funnel and product iterations using performance data and customer feedback.</w:t>
+      </w:r>
+    </w:p>
+    <w:p>
+      <w:pPr>
+        <w:pStyle w:val="ResumeBullet"/>
+        <w:keepLines/>
+        <w:numPr>
+          <w:ilvl w:val="0"/>
+          <w:numId w:val="10"/>
+        </w:numPr>
+        <w:spacing w:after="50"/>
+      </w:pPr>
+      <w:r>
+        <w:rPr>
+          <w:rFonts w:ascii="Arial" w:hAnsi="Arial" w:eastAsia="Arial"/>
+          <w:b w:val="0"/>
+          <w:color w:val="171917"/>
+          <w:sz w:val="18"/>
+          <w:u w:val="none"/>
+        </w:rPr>
+        <w:t>Whop’s public creator profile lists $210K+ earned; the current offer is rated 4.5/5 from eight ratings.</w:t>
       </w:r>
     </w:p>
     <w:p>
@@ -417,10 +457,12 @@
       <w:r>
         <w:rPr>
           <w:rFonts w:ascii="Arial" w:hAnsi="Arial" w:eastAsia="Arial"/>
+          <w:b w:val="0"/>
           <w:color w:val="171917"/>
           <w:sz w:val="18"/>
+          <w:u w:val="none"/>
         </w:rPr>
-        <w:t>Social Strategy | Short- and Long-Form Video | Content Operations | Community Management | Email Marketing | CRM / Lifecycle | Copywriting | Video Editing | Analytics | Landing Pages / CRO | YouTube | Facebook | Instagram | TikTok | Beehiiv | Discord | Telegram</w:t>
+        <w:t>Social Strategy | X (Twitter) | Facebook | Instagram | TikTok | Scriptwriting | Short- and Long-Form Video | Content Calendars | Publishing &amp; Scheduling | Community Management | Analytics &amp; Reporting | Email Marketing | Lifecycle / CRM | Lead Capture | Landing Pages / CRO | Memberships &amp; Subscriptions | Beehiiv | Discord | Telegram</w:t>
       </w:r>
     </w:p>
     <w:p>
@@ -436,11 +478,11 @@
         <w:rPr>
           <w:rFonts w:ascii="Arial" w:hAnsi="Arial" w:eastAsia="Arial"/>
           <w:b/>
-          <w:caps/>
           <w:color w:val="245A43"/>
           <w:sz w:val="19"/>
+          <w:u w:val="none"/>
         </w:rPr>
-        <w:t>SELECTED WORK</w:t>
+        <w:t>SELECTED PROOF</w:t>
       </w:r>
     </w:p>
     <w:p>
@@ -450,10 +492,9 @@
       <w:hyperlink r:id="rId9">
         <w:r>
           <w:rPr>
-            <w:rFonts w:ascii="Arial" w:hAnsi="Arial"/>
+            <w:rFonts w:ascii="Arial" w:hAnsi="Arial" w:eastAsia="Arial"/>
             <w:color w:val="245A43"/>
-            <w:sz w:val="17"/>
-            <w:b/>
+            <w:sz w:val="16"/>
             <w:u w:val="single"/>
           </w:rPr>
           <w:t>Portfolio</w:t>
@@ -462,18 +503,61 @@
       <w:r>
         <w:rPr>
           <w:rFonts w:ascii="Arial" w:hAnsi="Arial" w:eastAsia="Arial"/>
+          <w:b w:val="0"/>
           <w:color w:val="5F6762"/>
-          <w:sz w:val="17"/>
+          <w:sz w:val="16"/>
+          <w:u w:val="none"/>
+        </w:rPr>
+        <w:t xml:space="preserve">  |  </w:t>
+      </w:r>
+      <w:hyperlink r:id="rId13">
+        <w:r>
+          <w:rPr>
+            <w:rFonts w:ascii="Arial" w:hAnsi="Arial" w:eastAsia="Arial"/>
+            <w:color w:val="245A43"/>
+            <w:sz w:val="16"/>
+            <w:u w:val="single"/>
+          </w:rPr>
+          <w:t>Bors Facebook</w:t>
+        </w:r>
+      </w:hyperlink>
+      <w:r>
+        <w:rPr>
+          <w:rFonts w:ascii="Arial" w:hAnsi="Arial" w:eastAsia="Arial"/>
+          <w:b w:val="0"/>
+          <w:color w:val="5F6762"/>
+          <w:sz w:val="16"/>
+          <w:u w:val="none"/>
+        </w:rPr>
+        <w:t xml:space="preserve">  |  </w:t>
+      </w:r>
+      <w:hyperlink r:id="rId14">
+        <w:r>
+          <w:rPr>
+            <w:rFonts w:ascii="Arial" w:hAnsi="Arial" w:eastAsia="Arial"/>
+            <w:color w:val="245A43"/>
+            <w:sz w:val="16"/>
+            <w:u w:val="single"/>
+          </w:rPr>
+          <w:t>Public Reels</w:t>
+        </w:r>
+      </w:hyperlink>
+      <w:r>
+        <w:rPr>
+          <w:rFonts w:ascii="Arial" w:hAnsi="Arial" w:eastAsia="Arial"/>
+          <w:b w:val="0"/>
+          <w:color w:val="5F6762"/>
+          <w:sz w:val="16"/>
+          <w:u w:val="none"/>
         </w:rPr>
         <w:t xml:space="preserve">  |  </w:t>
       </w:r>
       <w:hyperlink r:id="rId11">
         <w:r>
           <w:rPr>
-            <w:rFonts w:ascii="Arial" w:hAnsi="Arial"/>
+            <w:rFonts w:ascii="Arial" w:hAnsi="Arial" w:eastAsia="Arial"/>
             <w:color w:val="245A43"/>
-            <w:sz w:val="17"/>
-            <w:b/>
+            <w:sz w:val="16"/>
             <w:u w:val="single"/>
           </w:rPr>
           <w:t>Video samples</w:t>
@@ -482,21 +566,43 @@
       <w:r>
         <w:rPr>
           <w:rFonts w:ascii="Arial" w:hAnsi="Arial" w:eastAsia="Arial"/>
+          <w:b w:val="0"/>
           <w:color w:val="5F6762"/>
-          <w:sz w:val="17"/>
+          <w:sz w:val="16"/>
+          <w:u w:val="none"/>
         </w:rPr>
         <w:t xml:space="preserve">  |  </w:t>
       </w:r>
-      <w:hyperlink r:id="rId12">
+      <w:hyperlink r:id="rId15">
         <w:r>
           <w:rPr>
-            <w:rFonts w:ascii="Arial" w:hAnsi="Arial"/>
+            <w:rFonts w:ascii="Arial" w:hAnsi="Arial" w:eastAsia="Arial"/>
             <w:color w:val="245A43"/>
-            <w:sz w:val="17"/>
-            <w:b/>
+            <w:sz w:val="16"/>
             <w:u w:val="single"/>
           </w:rPr>
-          <w:t>The Fifth Signal</w:t>
+          <w:t>Whop proof</w:t>
+        </w:r>
+      </w:hyperlink>
+      <w:r>
+        <w:rPr>
+          <w:rFonts w:ascii="Arial" w:hAnsi="Arial" w:eastAsia="Arial"/>
+          <w:b w:val="0"/>
+          <w:color w:val="5F6762"/>
+          <w:sz w:val="16"/>
+          <w:u w:val="none"/>
+        </w:rPr>
+        <w:t xml:space="preserve">  |  </w:t>
+      </w:r>
+      <w:hyperlink r:id="rId16">
+        <w:r>
+          <w:rPr>
+            <w:rFonts w:ascii="Arial" w:hAnsi="Arial" w:eastAsia="Arial"/>
+            <w:color w:val="245A43"/>
+            <w:sz w:val="16"/>
+            <w:u w:val="single"/>
+          </w:rPr>
+          <w:t>Independent coverage</w:t>
         </w:r>
       </w:hyperlink>
     </w:p>

</xml_diff>

<commit_message>
Add web developer proof and paid operating test
</commit_message>
<xml_diff>
--- a/assets/ben-horch-resume.docx
+++ b/assets/ben-horch-resume.docx
@@ -30,7 +30,7 @@
           <w:sz w:val="20"/>
           <w:u w:val="none"/>
         </w:rPr>
-        <w:t>SOCIAL MEDIA &amp; GROWTH MANAGER  |  CONTENT, COMMUNITY &amp; EMAIL/CRM</w:t>
+        <w:t>SOCIAL MEDIA &amp; GROWTH MANAGER  |  WEB DEVELOPER  |  EMAIL/CRM</w:t>
       </w:r>
     </w:p>
     <w:p>
@@ -116,7 +116,7 @@
           <w:sz w:val="19"/>
           <w:u w:val="none"/>
         </w:rPr>
-        <w:t>Founder-led social, content, and lifecycle marketer with nearly four years of hands-on experience building audiences and the systems that turn attention into leads, members, and customers. Founded Bors Finance and launched every brand channel from zero across X, Facebook, Instagram, TikTok, YouTube, Discord, Telegram, and email. Owns the full workflow: strategy, research, scripts, production, posting, community, performance analysis, email funnels, conversion, and retention.</w:t>
+        <w:t>Social media and growth marketer and web developer with nearly four years of hands-on experience building audiences, websites, and the systems that turn attention into leads, members, and customers. Founded Bors Finance and launched every brand channel from zero. Designed, developed, wrote, and deployed TheFifthSignal.com and BorsIntel.com. Owns the full workflow: strategy, scripts, production, publishing, community, responsive web builds, email funnels, conversion, analysis, and retention.</w:t>
       </w:r>
     </w:p>
     <w:p>
@@ -150,7 +150,7 @@
           <w:sz w:val="16"/>
           <w:u w:val="none"/>
         </w:rPr>
-        <w:t>0 to 62K+ Facebook  |  550K top public Reel  |  43.8K historical video peak  |  approx. 22K email  |  45.1% latest open  |  Whop profile: $210K+ earned</w:t>
+        <w:t>0 to 62K+ Facebook  |  550K top public Reel  |  43.8K historical video peak  |  approx. 22K email  |  45.1% latest open  |  $210K+ listed on Whop  |  2 live websites built</w:t>
       </w:r>
     </w:p>
     <w:p>
@@ -342,8 +342,9 @@
           <w:b/>
           <w:color w:val="5F6762"/>
           <w:sz w:val="18"/>
+          <w:u w:val="none"/>
         </w:rPr>
-        <w:t>Founder | Email, Lifecycle and Growth</w:t>
+        <w:t>Founder | Growth, Lifecycle &amp; Web Development</w:t>
       </w:r>
     </w:p>
     <w:p>
@@ -385,7 +386,7 @@
           <w:sz w:val="18"/>
           <w:u w:val="none"/>
         </w:rPr>
-        <w:t>Built and operated the acquisition-to-retention funnel across landing pages, lead capture, checkout, lifecycle email, Telegram delivery, memberships, retention, and customer support.</w:t>
+        <w:t>Designed, developed, wrote, and deployed The Fifth Signal’s responsive customer-facing website and acquisition-to-retention funnel across landing pages, lead capture, checkout pathways, lifecycle email, Telegram delivery, memberships, and customer support.</w:t>
       </w:r>
     </w:p>
     <w:p>
@@ -406,7 +407,7 @@
           <w:sz w:val="18"/>
           <w:u w:val="none"/>
         </w:rPr>
-        <w:t>Shipped 30+ funnel and product iterations using performance data and customer feedback.</w:t>
+        <w:t>Shipped 30+ website, funnel, and product iterations using performance data and customer feedback.</w:t>
       </w:r>
     </w:p>
     <w:p>
@@ -428,6 +429,75 @@
           <w:u w:val="none"/>
         </w:rPr>
         <w:t>Whop’s public creator profile lists $210K+ earned; the current offer is rated 4.5/5 from eight ratings.</w:t>
+      </w:r>
+    </w:p>
+    <w:p>
+      <w:pPr>
+        <w:pStyle w:val="Heading1"/>
+      </w:pPr>
+      <w:r>
+        <w:rPr>
+          <w:rFonts w:ascii="Arial" w:hAnsi="Arial" w:eastAsia="Arial"/>
+          <w:b/>
+          <w:color w:val="245A43"/>
+          <w:sz w:val="19"/>
+          <w:u w:val="none"/>
+        </w:rPr>
+        <w:t>SELECTED WEB DEVELOPMENT</w:t>
+      </w:r>
+    </w:p>
+    <w:p>
+      <w:pPr>
+        <w:spacing w:after="40"/>
+      </w:pPr>
+      <w:hyperlink r:id="rId9">
+        <w:r>
+          <w:rPr>
+            <w:rFonts w:ascii="Arial" w:hAnsi="Arial" w:eastAsia="Arial"/>
+            <w:color w:val="245A43"/>
+            <w:sz w:val="17"/>
+            <w:b/>
+            <w:u w:val="single"/>
+          </w:rPr>
+          <w:t>BorsIntel.com | Portfolio &amp; Proof Website</w:t>
+        </w:r>
+      </w:hyperlink>
+      <w:r>
+        <w:rPr>
+          <w:rFonts w:ascii="Arial" w:hAnsi="Arial" w:eastAsia="Arial"/>
+          <w:b w:val="0"/>
+          <w:color w:val="171917"/>
+          <w:sz w:val="17"/>
+          <w:u w:val="none"/>
+        </w:rPr>
+        <w:t xml:space="preserve"> — Designed, developed, wrote, and deployed this responsive portfolio, including its evidence architecture, accessible contact actions, SEO metadata, front-end QA, and GitHub-to-Netlify release workflow.</w:t>
+      </w:r>
+    </w:p>
+    <w:p>
+      <w:pPr>
+        <w:spacing w:after="100"/>
+      </w:pPr>
+      <w:hyperlink r:id="rId12">
+        <w:r>
+          <w:rPr>
+            <w:rFonts w:ascii="Arial" w:hAnsi="Arial" w:eastAsia="Arial"/>
+            <w:color w:val="245A43"/>
+            <w:sz w:val="17"/>
+            <w:b/>
+            <w:u w:val="single"/>
+          </w:rPr>
+          <w:t>TheFifthSignal.com | Marketing &amp; Subscription Website</w:t>
+        </w:r>
+      </w:hyperlink>
+      <w:r>
+        <w:rPr>
+          <w:rFonts w:ascii="Arial" w:hAnsi="Arial" w:eastAsia="Arial"/>
+          <w:b w:val="0"/>
+          <w:color w:val="171917"/>
+          <w:sz w:val="17"/>
+          <w:u w:val="none"/>
+        </w:rPr>
+        <w:t xml:space="preserve"> — Designed and developed the responsive customer-facing site and conversion flow, including front-end implementation, lead capture, offer presentation, checkout pathways, mobile QA, and ongoing iteration.</w:t>
       </w:r>
     </w:p>
     <w:p>
@@ -462,7 +532,7 @@
           <w:sz w:val="18"/>
           <w:u w:val="none"/>
         </w:rPr>
-        <w:t>Social Strategy | X (Twitter) | Facebook | Instagram | TikTok | Scriptwriting | Short- and Long-Form Video | Content Calendars | Publishing &amp; Scheduling | Community Management | Analytics &amp; Reporting | Email Marketing | Lifecycle / CRM | Lead Capture | Landing Pages / CRO | Memberships &amp; Subscriptions | Beehiiv | Discord | Telegram</w:t>
+        <w:t>Social Strategy | X (Twitter) | Facebook | Instagram | TikTok | Scriptwriting | Content Production | Publishing &amp; Scheduling | Community Management | Analytics &amp; Reporting | Email Marketing | Lifecycle / CRM | Web Development | Responsive Web Design | HTML | CSS | JavaScript | Landing Pages / CRO | GitHub | Netlify | Beehiiv | Discord | Telegram</w:t>
       </w:r>
     </w:p>
     <w:p>
@@ -497,7 +567,28 @@
             <w:sz w:val="16"/>
             <w:u w:val="single"/>
           </w:rPr>
-          <w:t>Portfolio</w:t>
+          <w:t>BorsIntel.com — live build</w:t>
+        </w:r>
+      </w:hyperlink>
+      <w:r>
+        <w:rPr>
+          <w:rFonts w:ascii="Arial" w:hAnsi="Arial" w:eastAsia="Arial"/>
+          <w:b w:val="0"/>
+          <w:color w:val="5F6762"/>
+          <w:sz w:val="16"/>
+          <w:u w:val="none"/>
+        </w:rPr>
+        <w:t xml:space="preserve">  |  </w:t>
+      </w:r>
+      <w:hyperlink r:id="rId12">
+        <w:r>
+          <w:rPr>
+            <w:rFonts w:ascii="Arial" w:hAnsi="Arial" w:eastAsia="Arial"/>
+            <w:color w:val="245A43"/>
+            <w:sz w:val="16"/>
+            <w:u w:val="single"/>
+          </w:rPr>
+          <w:t>TheFifthSignal.com — live build</w:t>
         </w:r>
       </w:hyperlink>
       <w:r>

</xml_diff>

<commit_message>
Add AI workflow design and training proof
</commit_message>
<xml_diff>
--- a/assets/ben-horch-resume.docx
+++ b/assets/ben-horch-resume.docx
@@ -27,10 +27,9 @@
           <w:rFonts w:ascii="Arial" w:hAnsi="Arial" w:eastAsia="Arial"/>
           <w:b/>
           <w:color w:val="245A43"/>
-          <w:sz w:val="20"/>
-          <w:u w:val="none"/>
+          <w:sz w:val="18"/>
         </w:rPr>
-        <w:t>SOCIAL MEDIA &amp; GROWTH MANAGER  |  WEB DEVELOPER  |  EMAIL/CRM</w:t>
+        <w:t>SOCIAL MEDIA &amp; GROWTH MANAGER  |  WEB DEVELOPER  |  AI WORKFLOW DESIGN &amp; TRAINING</w:t>
       </w:r>
     </w:p>
     <w:p>
@@ -113,10 +112,10 @@
           <w:rFonts w:ascii="Arial" w:hAnsi="Arial" w:eastAsia="Arial"/>
           <w:b w:val="0"/>
           <w:color w:val="171917"/>
-          <w:sz w:val="19"/>
+          <w:sz w:val="18"/>
           <w:u w:val="none"/>
         </w:rPr>
-        <w:t>Social media and growth marketer and web developer with nearly four years of hands-on experience building audiences, websites, and the systems that turn attention into leads, members, and customers. Founded Bors Finance and launched every brand channel from zero. Designed, developed, wrote, and deployed TheFifthSignal.com and BorsIntel.com. Owns the full workflow: strategy, scripts, production, publishing, community, responsive web builds, email funnels, conversion, analysis, and retention.</w:t>
+        <w:t>Social media and growth manager, web developer, and AI workflow designer with nearly four years building audiences and systems that turn attention into customers. Founded Bors Finance and launched every brand channel from zero. Builds repeatable GPT workflows for research, source verification, scripting, repurposing, newsletters, reports, and analysis with documented prompts, guardrails, review loops, and team-ready training.</w:t>
       </w:r>
     </w:p>
     <w:p>
@@ -150,7 +149,7 @@
           <w:sz w:val="16"/>
           <w:u w:val="none"/>
         </w:rPr>
-        <w:t>0 to 62K+ Facebook  |  550K top public Reel  |  43.8K historical video peak  |  approx. 22K email  |  45.1% latest open  |  $210K+ listed on Whop  |  2 live websites built</w:t>
+        <w:t>0 to 62K+ Facebook  |  550K top public Reel  |  43.8K historical video peak  |  approx. 22K email  |  45.1% latest open  |  $210K+ listed on Whop  |  2 live sites  |  3 documented AI systems</w:t>
       </w:r>
     </w:p>
     <w:p>
@@ -278,7 +277,7 @@
           <w:sz w:val="18"/>
           <w:u w:val="none"/>
         </w:rPr>
-        <w:t>Ran end-to-end content operations: research, hooks, scripts, short- and long-form editing, captions, B-roll, audio, calendars, posting, community management, analytics, testing, and strategy reviews.</w:t>
+        <w:t>Ran end-to-end content operations across research, scripting, production, publishing, community, analytics, and strategy reviews; built reusable GPT workflows for source checks, hooks, platform adaptation, newsletters, reports, and repurposing while retaining final editorial approval.</w:t>
       </w:r>
     </w:p>
     <w:p>
@@ -443,13 +442,23 @@
           <w:sz w:val="19"/>
           <w:u w:val="none"/>
         </w:rPr>
-        <w:t>SELECTED WEB DEVELOPMENT</w:t>
+        <w:t>SELECTED WEB &amp; AI SYSTEMS</w:t>
       </w:r>
     </w:p>
     <w:p>
       <w:pPr>
         <w:spacing w:after="40"/>
       </w:pPr>
+      <w:r>
+        <w:rPr>
+          <w:rFonts w:ascii="Arial" w:hAnsi="Arial" w:eastAsia="Arial"/>
+          <w:b/>
+          <w:color w:val="171917"/>
+          <w:sz w:val="17"/>
+          <w:u w:val="none"/>
+        </w:rPr>
+        <w:t xml:space="preserve">Web Development - Built and deployed </w:t>
+      </w:r>
       <w:hyperlink r:id="rId9">
         <w:r>
           <w:rPr>
@@ -459,7 +468,29 @@
             <w:b/>
             <w:u w:val="single"/>
           </w:rPr>
-          <w:t>BorsIntel.com | Portfolio &amp; Proof Website</w:t>
+          <w:t>BorsIntel.com</w:t>
+        </w:r>
+      </w:hyperlink>
+      <w:r>
+        <w:rPr>
+          <w:rFonts w:ascii="Arial" w:hAnsi="Arial" w:eastAsia="Arial"/>
+          <w:b/>
+          <w:color w:val="171917"/>
+          <w:sz w:val="17"/>
+          <w:u w:val="none"/>
+        </w:rPr>
+        <w:t xml:space="preserve"> and </w:t>
+      </w:r>
+      <w:hyperlink r:id="rId12">
+        <w:r>
+          <w:rPr>
+            <w:rFonts w:ascii="Arial" w:hAnsi="Arial" w:eastAsia="Arial"/>
+            <w:color w:val="245A43"/>
+            <w:sz w:val="17"/>
+            <w:b/>
+            <w:u w:val="single"/>
+          </w:rPr>
+          <w:t>TheFifthSignal.com</w:t>
         </w:r>
       </w:hyperlink>
       <w:r>
@@ -470,34 +501,30 @@
           <w:sz w:val="17"/>
           <w:u w:val="none"/>
         </w:rPr>
-        <w:t xml:space="preserve"> — Designed, developed, wrote, and deployed this responsive portfolio, including its evidence architecture, accessible contact actions, SEO metadata, front-end QA, and GitHub-to-Netlify release workflow.</w:t>
+        <w:t xml:space="preserve"> end to end: responsive UX, copy, conversion flows, front-end implementation, QA, GitHub, Netlify, and ongoing iteration.</w:t>
       </w:r>
     </w:p>
     <w:p>
       <w:pPr>
         <w:spacing w:after="100"/>
       </w:pPr>
-      <w:hyperlink r:id="rId12">
-        <w:r>
-          <w:rPr>
-            <w:rFonts w:ascii="Arial" w:hAnsi="Arial" w:eastAsia="Arial"/>
-            <w:color w:val="245A43"/>
-            <w:sz w:val="17"/>
-            <w:b/>
-            <w:u w:val="single"/>
-          </w:rPr>
-          <w:t>TheFifthSignal.com | Marketing &amp; Subscription Website</w:t>
-        </w:r>
-      </w:hyperlink>
+      <w:r>
+        <w:rPr>
+          <w:rFonts w:ascii="Arial" w:hAnsi="Arial" w:eastAsia="Arial"/>
+          <w:b/>
+          <w:color w:val="171917"/>
+          <w:sz w:val="17"/>
+        </w:rPr>
+        <w:t xml:space="preserve">AI Workflow Design &amp; Team Training - </w:t>
+      </w:r>
       <w:r>
         <w:rPr>
           <w:rFonts w:ascii="Arial" w:hAnsi="Arial" w:eastAsia="Arial"/>
           <w:b w:val="0"/>
           <w:color w:val="171917"/>
           <w:sz w:val="17"/>
-          <w:u w:val="none"/>
         </w:rPr>
-        <w:t xml:space="preserve"> — Designed and developed the responsive customer-facing site and conversion flow, including front-end implementation, lead capture, offer presentation, checkout pathways, mobile QA, and ongoing iteration.</w:t>
+        <w:t>Built role-specific GPT systems for source-backed research, X posts and replies, newsletters, long-form reports, performance analysis, and repurposing. Documents instructions, examples, source and brand guardrails, revision loops, and approval checks so teams can learn and run each workflow consistently.</w:t>
       </w:r>
     </w:p>
     <w:p>
@@ -529,10 +556,10 @@
           <w:rFonts w:ascii="Arial" w:hAnsi="Arial" w:eastAsia="Arial"/>
           <w:b w:val="0"/>
           <w:color w:val="171917"/>
-          <w:sz w:val="18"/>
+          <w:sz w:val="17"/>
           <w:u w:val="none"/>
         </w:rPr>
-        <w:t>Social Strategy | X (Twitter) | Facebook | Instagram | TikTok | Scriptwriting | Content Production | Publishing &amp; Scheduling | Community Management | Analytics &amp; Reporting | Email Marketing | Lifecycle / CRM | Web Development | Responsive Web Design | HTML | CSS | JavaScript | Landing Pages / CRO | GitHub | Netlify | Beehiiv | Discord | Telegram</w:t>
+        <w:t>Social Strategy | X (Twitter) | Facebook | Instagram | TikTok | Scriptwriting | Content Operations | Email/CRM | AI Workflow Design | Generative AI | Prompt &amp; System Instructions | Team AI Training &amp; SOPs | Source Verification | Human-in-the-Loop QA | Web Development | HTML/CSS/JavaScript | Landing Pages/CRO | GitHub | Netlify | Beehiiv | Discord | Telegram</w:t>
       </w:r>
     </w:p>
     <w:p>
@@ -567,7 +594,28 @@
             <w:sz w:val="16"/>
             <w:u w:val="single"/>
           </w:rPr>
-          <w:t>BorsIntel.com — live build</w:t>
+          <w:t>Portfolio</w:t>
+        </w:r>
+      </w:hyperlink>
+      <w:r>
+        <w:rPr>
+          <w:rFonts w:ascii="Arial" w:hAnsi="Arial" w:eastAsia="Arial"/>
+          <w:b w:val="0"/>
+          <w:color w:val="5F6762"/>
+          <w:sz w:val="16"/>
+          <w:u w:val="none"/>
+        </w:rPr>
+        <w:t xml:space="preserve">  |  </w:t>
+      </w:r>
+      <w:hyperlink r:id="rId17">
+        <w:r>
+          <w:rPr>
+            <w:rFonts w:ascii="Arial" w:hAnsi="Arial" w:eastAsia="Arial"/>
+            <w:color w:val="245A43"/>
+            <w:sz w:val="16"/>
+            <w:u w:val="single"/>
+          </w:rPr>
+          <w:t>AI workflow examples</w:t>
         </w:r>
       </w:hyperlink>
       <w:r>
@@ -588,7 +636,7 @@
             <w:sz w:val="16"/>
             <w:u w:val="single"/>
           </w:rPr>
-          <w:t>TheFifthSignal.com — live build</w:t>
+          <w:t>The Fifth Signal</w:t>
         </w:r>
       </w:hyperlink>
       <w:r>
@@ -631,27 +679,6 @@
             <w:u w:val="single"/>
           </w:rPr>
           <w:t>Public Reels</w:t>
-        </w:r>
-      </w:hyperlink>
-      <w:r>
-        <w:rPr>
-          <w:rFonts w:ascii="Arial" w:hAnsi="Arial" w:eastAsia="Arial"/>
-          <w:b w:val="0"/>
-          <w:color w:val="5F6762"/>
-          <w:sz w:val="16"/>
-          <w:u w:val="none"/>
-        </w:rPr>
-        <w:t xml:space="preserve">  |  </w:t>
-      </w:r>
-      <w:hyperlink r:id="rId11">
-        <w:r>
-          <w:rPr>
-            <w:rFonts w:ascii="Arial" w:hAnsi="Arial" w:eastAsia="Arial"/>
-            <w:color w:val="245A43"/>
-            <w:sz w:val="16"/>
-            <w:u w:val="single"/>
-          </w:rPr>
-          <w:t>Video samples</w:t>
         </w:r>
       </w:hyperlink>
       <w:r>

</xml_diff>